<commit_message>
Laboratoriya ishini tahrirlash: matn qayta yozildi va rasmlar o'zgartirildi
Co-authored-by: komronigris1119-byte <289546181+komronigris1119-byte@users.noreply.github.com>
</commit_message>
<xml_diff>
--- a/To'xtaturimova Mohichehra 1.2.3.docx
+++ b/To'xtaturimova Mohichehra 1.2.3.docx
@@ -365,7 +365,7 @@
           <w:szCs w:val="28"/>
           <w:lang w:val="en-US"/>
         </w:rPr>
-        <w:t xml:space="preserve"> Sxemaga ikkita sinus bloki ulangan. Biri yuqori chastotali (tashuvchi signal), ikkinchisi esa past chastotali signallarni shakllantiradi.</w:t>
+        <w:t xml:space="preserve"> Modelga ikkita Sine Wave bloki o'rnatilgan. Ulardan biri yuqori chastotali tashuvchi to'lqinni, ikkinchisi esa past chastotali axborot to'lqinini hosil qiladi.</w:t>
       </w:r>
     </w:p>
     <w:p>
@@ -394,7 +394,7 @@
           <w:szCs w:val="28"/>
           <w:lang w:val="en-US"/>
         </w:rPr>
-        <w:t xml:space="preserve"> To'rtburchak shakldagi boshqaruvchi impuls signalini yaratadi. U switch (kalit) ning holatini o'zgartirish (u kanaldan bu kanalga o'tish) uchun xizmat qiladi.</w:t>
+        <w:t xml:space="preserve"> To'rtburchak ko'rinishidagi boshqaruv impulslarini generatsiya qiladi. Aynan shu signal Switch blokining qaysi kirishni chiqishga ulashini (bir kanaldan ikkinchisiga o'tishni) belgilaydi.</w:t>
       </w:r>
     </w:p>
     <w:p>
@@ -423,7 +423,7 @@
           <w:szCs w:val="28"/>
           <w:lang w:val="en-US"/>
         </w:rPr>
-        <w:t xml:space="preserve"> Markazdagi asosiy blok. Agar boshqaruvchi impuls darajasi ma'lum bir chegaradan yuqori bo'lsa, 1-kanal (yuqori chastotali sinus) o'tadi, aks holda 2-kanal (past chastotali sinus) o'tadi.</w:t>
+        <w:t xml:space="preserve"> Sxemaning yuragi hisoblanadi. Boshqaruvchi impuls qiymati belgilangan ostonadan oshsa 1-kanal (yuqori chastotali sinus), aks holda 2-kanal (past chastotali sinus) chiqishga uzatiladi.</w:t>
       </w:r>
     </w:p>
     <w:p>
@@ -450,7 +450,7 @@
           <w:szCs w:val="28"/>
           <w:lang w:val="en-US"/>
         </w:rPr>
-        <w:t xml:space="preserve"> Jarayon va natijalarni grafik ko'rinishida kuzatish uchun foydalanilgan</w:t>
+        <w:t xml:space="preserve"> Modelning kirish va chiqish signallarini grafik tarzda kuzatish hamda solishtirish maqsadida ishlatiladi</w:t>
       </w:r>
       <w:r>
         <w:rPr>
@@ -639,7 +639,7 @@
           <w:szCs w:val="28"/>
           <w:lang w:val="en-US"/>
         </w:rPr>
-        <w:t xml:space="preserve"> kalit so'zi orqali qidiruv berilgan. Tanlangan </w:t>
+        <w:t xml:space="preserve"> kalit so'zi bo'yicha qidirildi. Topilgan </w:t>
       </w:r>
       <w:r>
         <w:rPr>
@@ -659,7 +659,7 @@
           <w:szCs w:val="28"/>
           <w:lang w:val="en-US"/>
         </w:rPr>
-        <w:t xml:space="preserve"> bloki sxemadagi kalitni (Switch) boshqarish uchun xizmat qiladi. U ma'lum bir davriylikda mantiqiy "1" va "0" (yuqori va past) impulslarni ishlab chiqaradi</w:t>
+        <w:t xml:space="preserve"> bloki modeldagi Switch elementini boshqaradi. U belgilangan davr bilan mantiqiy 1 va 0 (yuqori hamda past) impulslarni navbatma-navbat chiqaradi</w:t>
       </w:r>
       <w:r>
         <w:rPr>
@@ -699,7 +699,7 @@
           <w:szCs w:val="28"/>
           <w:lang w:val="en-US"/>
         </w:rPr>
-        <w:t xml:space="preserve">Oshillograf ekranidagi sariq rangli grafik — ikki xil signalning vaqt bo'yicha ketma-ket almashinib kelishidan hosil bo'lgan </w:t>
+        <w:t xml:space="preserve">Oshillograf ekranidagi sariq egri chiziq ikkita turli signalning vaqt o'qi bo'ylab navbatma-navbat almashinishidan vujudga kelgan </w:t>
       </w:r>
       <w:r>
         <w:rPr>
@@ -770,7 +770,7 @@
           <w:szCs w:val="28"/>
           <w:lang w:val="en-US"/>
         </w:rPr>
-        <w:t xml:space="preserve"> gacha) bo'yicha tahlil qilsak, tizim quyidagicha ishlaganini ko'rishimiz mumkin:</w:t>
+        <w:t xml:space="preserve"> gacha) bo'ylab kuzatsak, tizimning ishlash mantig'i quyidagicha bo'ladi:</w:t>
       </w:r>
     </w:p>
     <w:p>
@@ -799,7 +799,7 @@
           <w:szCs w:val="28"/>
           <w:lang w:val="en-US"/>
         </w:rPr>
-        <w:t xml:space="preserve"> Bu vaqtda boshqaruvchi impuls generatori mantiqiy "1" signalini bergan. Natijada </w:t>
+        <w:t xml:space="preserve"> Ushbu intervalda boshqaruv generatori mantiqiy 1 darajasini chiqargan. Shu sababli </w:t>
       </w:r>
       <w:r>
         <w:rPr>
@@ -817,7 +817,7 @@
           <w:szCs w:val="28"/>
           <w:lang w:val="en-US"/>
         </w:rPr>
-        <w:t xml:space="preserve"> yuqoridagi birinchi kanalni yoqqan va chiqishda amplituda va chastotasi yuqori bo'lgan signal o'tgan.</w:t>
+        <w:t xml:space="preserve"> birinchi (yuqori) kanalga ulanib, chiqishga amplitudasi va chastotasi yuqori signalni uzatgan.</w:t>
       </w:r>
     </w:p>
     <w:p>
@@ -846,7 +846,7 @@
           <w:szCs w:val="28"/>
           <w:lang w:val="en-US"/>
         </w:rPr>
-        <w:t xml:space="preserve"> Bu vaqtda impuls generatori mantiqiy "0" holatiga o'tgan. Kalit avtomatik ravishda pastki kanalga ulanib, chiqishga past chastotali, ravon sinusoidal signalni uzatgan.</w:t>
+        <w:t xml:space="preserve"> Bu oraliqda generator mantiqiy 0 holatiga tushgan. Kalit o'z-o'zidan pastki kanalga o'tib, chiqishga past chastotali silliq sinus to'lqinini bergan.</w:t>
       </w:r>
     </w:p>
     <w:p>
@@ -920,7 +920,7 @@
           <w:szCs w:val="28"/>
           <w:lang w:val="en-US"/>
         </w:rPr>
-        <w:t xml:space="preserve"> modulyatsiyalarining sodda ko'rinishini ifodalaydi.</w:t>
+        <w:t xml:space="preserve"> modulyatsiya turlarining eng sodda namunasini aks ettiradi.</w:t>
       </w:r>
     </w:p>
     <w:p>
@@ -949,7 +949,7 @@
           <w:szCs w:val="28"/>
           <w:lang w:val="en-US"/>
         </w:rPr>
-        <w:t xml:space="preserve"> rasmdagi grafik laboratoriya ishining yakuniy natijasi bo'lib, u raqamli kalit yordamida ikkita har xil xarakteristikaga ega analog signalni bitta umumiy kanalga vaqt bo'yicha taqsimlab uzatish mumkinligini isbotlaydi.</w:t>
+        <w:t xml:space="preserve"> ushbu grafik ishning yakuniy natijasi bo'lib, raqamli kalit yordamida xarakteristikasi har xil bo'lgan ikki analog signalni bitta umumiy kanal orqali vaqt bo'yicha taqsimlab uzatish mumkinligini ko'rsatadi.</w:t>
       </w:r>
     </w:p>
     <w:p>
@@ -1114,7 +1114,7 @@
           <w:szCs w:val="28"/>
           <w:lang w:val="en-US"/>
         </w:rPr>
-        <w:t xml:space="preserve"> oynasi va uning chap tomonidagi </w:t>
+        <w:t xml:space="preserve"> oynasi hamda uning chap qismidagi </w:t>
       </w:r>
       <w:r>
         <w:rPr>
@@ -1151,7 +1151,7 @@
           <w:szCs w:val="28"/>
           <w:lang w:val="en-US"/>
         </w:rPr>
-        <w:t>Agar 2-rasmda faqat yakuniy natija ko'rsatilgan bo'lsa, 3-rasmda laboratoriya ishining butun mexanizmi — kirish signallari, boshqaruvchi signal va chiqish signali alohida panellarda (kanallarda) namoyon bo'lgan.</w:t>
+        <w:t>2-rasmda faqat oxirgi natija aks etgan bo'lsa, 3-rasmda ishning to'liq mexanizmi — kirish signallari, boshqaruv signali va chiqish signali har biri alohida kanalda yonma-yon ko'rsatilgan.</w:t>
       </w:r>
     </w:p>
     <w:p>
@@ -1203,7 +1203,7 @@
           <w:szCs w:val="28"/>
           <w:lang w:val="en-US"/>
         </w:rPr>
-        <w:t xml:space="preserve"> so'zi orqali qidiruv berilganda hosil bo'lgan bloklar ro'yxati turibdi. Rasmda </w:t>
+        <w:t xml:space="preserve"> so'zi orqali izlanganda chiqqan bloklar ro'yxati ko'rsatilgan. Rasmda </w:t>
       </w:r>
       <w:r>
         <w:rPr>
@@ -1221,7 +1221,7 @@
           <w:szCs w:val="28"/>
           <w:lang w:val="en-US"/>
         </w:rPr>
-        <w:t xml:space="preserve"> (Ko'p portli kalit) tanlangan. Bu blok laboratoriyada bir nechta signal manbalarini bitta mantiqiy kalit orqali navbatma-navbat boshqarish va chiqishga yo'naltirish imkoniyatini ko'rsatish uchun qidirilgan.</w:t>
+        <w:t xml:space="preserve"> (Ko'p portli kalit) tanlangan. Bu blok bir nechta signal manbasini yagona mantiqiy boshqaruv orqali navbat bilan chiqishga yo'naltirish imkonini namoyish qilish uchun ishlatilgan.</w:t>
       </w:r>
     </w:p>
     <w:p>
@@ -1279,7 +1279,7 @@
           <w:sz w:val="28"/>
           <w:szCs w:val="28"/>
         </w:rPr>
-        <w:t>Jarayonni pastdan yuqoriga qarab mantiqiy ketma-ketlikda tushunish osonroq:</w:t>
+        <w:t> Mantiqni tushunish uchun panellarni pastdan yuqoriga qarab ko'rib chiqamiz:</w:t>
       </w:r>
     </w:p>
     <w:p>
@@ -1308,7 +1308,7 @@
           <w:szCs w:val="28"/>
           <w:lang w:val="en-US"/>
         </w:rPr>
-        <w:t xml:space="preserve"> Bu birinchi kirish signali — past chastotali va ravon sinusoidal to'lqin.</w:t>
+        <w:t xml:space="preserve"> Birinchi kirish signali — past chastotali, ravon sinus to'lqin.</w:t>
       </w:r>
     </w:p>
     <w:p>
@@ -1337,7 +1337,7 @@
           <w:szCs w:val="28"/>
           <w:lang w:val="en-US"/>
         </w:rPr>
-        <w:t xml:space="preserve"> Bu ikkinchi kirish signali — yuqori chastotali, zich va balandroq amplitudali sinusoidal to'lqin (tashuvchi signal).</w:t>
+        <w:t xml:space="preserve"> Ikkinchi kirish signali — yuqori chastotali, zich va kattaroq amplitudali tashuvchi sinus to'lqin.</w:t>
       </w:r>
     </w:p>
     <w:p>
@@ -1384,7 +1384,7 @@
           <w:szCs w:val="28"/>
           <w:lang w:val="en-US"/>
         </w:rPr>
-        <w:t xml:space="preserve"> (Impuls generatori) signali. Ko'rinib turibdiki, u faqat ikki xil qiymatga ega: Yuqori (Mantiqiy "1") va Past (Mantiqiy "0").</w:t>
+        <w:t xml:space="preserve"> (Impuls generatori) signali. Ko'rinib turibdiki, u atigi ikki qiymat oladi: yuqori (mantiqiy 1) va past (mantiqiy 0).</w:t>
       </w:r>
     </w:p>
     <w:p>
@@ -1471,7 +1471,7 @@
           <w:szCs w:val="28"/>
           <w:lang w:val="en-US"/>
         </w:rPr>
-        <w:t>Ushbu grafiklar laboratoriya ishining fundamental qoidasini to'liq isbotlaydi:</w:t>
+        <w:t>Quyidagi grafiklar ishning asosiy qonuniyatini to'liq tasdiqlaydi:</w:t>
       </w:r>
     </w:p>
     <w:p>
@@ -1500,7 +1500,7 @@
           <w:szCs w:val="28"/>
           <w:lang w:val="en-US"/>
         </w:rPr>
-        <w:t xml:space="preserve"> Kalit 3-grafikdagi zich (yuqori chastotali) signalni o'ziga ulaydi va uni eng tepadagi (1-grafik) chiqishga uzatadi.</w:t>
+        <w:t xml:space="preserve"> Kalit 3-grafikdagi zich (yuqori chastotali) signalni qabul qilib, uni eng yuqoridagi (1-grafik) chiqishga uzatadi.</w:t>
       </w:r>
     </w:p>
     <w:p>
@@ -1529,7 +1529,7 @@
           <w:szCs w:val="28"/>
           <w:lang w:val="en-US"/>
         </w:rPr>
-        <w:t xml:space="preserve"> Kalit pozitsiyasini o'zgartirib, 4-grafikdagi silliq (past chastotali) signalni oladi va uni eng tepadagi chiqishga uzatadi.</w:t>
+        <w:t xml:space="preserve"> Kalit holatini almashtirib, 4-grafikdagi silliq (past chastotali) signalni olib, uni yuqoridagi chiqishga beradi.</w:t>
       </w:r>
     </w:p>
     <w:p>
@@ -1607,13 +1607,13 @@
           <w:szCs w:val="28"/>
           <w:lang w:val="en-US"/>
         </w:rPr>
-        <w:t xml:space="preserve"> zanjiri vizual tarzda</w:t>
-      </w:r>
-      <w:r>
-        <w:rPr>
-          <w:lang w:val="en-US"/>
-        </w:rPr>
-        <w:t xml:space="preserve"> alohida-alohida va o'zaro solishtirilgan holda ko'rsatilgan. Bu talabaga kommutatsiya va modulyatsiya jarayonini to'liq tahlil qilish imkonini beradi.</w:t>
+        <w:t xml:space="preserve"> zanjiri ko'rgazmali tarzda</w:t>
+      </w:r>
+      <w:r>
+        <w:rPr>
+          <w:lang w:val="en-US"/>
+        </w:rPr>
+        <w:t xml:space="preserve"> har biri alohida va bir-biriga taqqoslangan holda berilgan. Bu talabaga kommutatsiya va modulyatsiya jarayonini chuqur tahlil qilish imkonini beradi.</w:t>
       </w:r>
     </w:p>
     <w:p>
@@ -2077,7 +2077,7 @@
           <w:szCs w:val="28"/>
           <w:lang w:val="en-US"/>
         </w:rPr>
-        <w:t>Simulink MATLAB tarkibiga kiruvchi grafik modellashtirish muhiti bo‘lib, dinamik tizimlarni yaratish, tahlil qilish va simulyatsiya qilish imkonini beradi. Unda matematik, elektr, mexanik, avtomatik boshqaruv va signalni qayta ishlash tizimlarini bloklar yordamida modellashtirish mumkin. Simulink natijalarni grafik ko‘rinishda olish va tizimlarning ishlashini tekshirish imkoniyatini ham beradi.</w:t>
+        <w:t>Simulink — MATLAB tarkibidagi vizual modellashtirish muhiti bo'lib, dinamik tizimlarni qurish, tahlil etish va simulyatsiya qilishga xizmat qiladi. U yordamida matematik, elektr, mexanik, avtomatik boshqaruv hamda signallarni qayta ishlash tizimlarini bloklar ko'rinishida yig'ish mumkin. Bundan tashqari Simulink natijalarni grafik shaklda taqdim etadi va tizim ishini tekshirish imkonini beradi.</w:t>
       </w:r>
     </w:p>
     <w:p>
@@ -3363,7 +3363,7 @@
           <w:szCs w:val="28"/>
           <w:lang w:val="en-US"/>
         </w:rPr>
-        <w:t>Blok ustiga sichqoncha ko‘rsatkichi olib boriladi va chap tugma bosilgan holda blok kerakli joyga sudrab o‘tkaziladi. Zarur bo‘lsa, blokni aylantirish yoki akslantirish buyruqlaridan ham foydalanish mumkin.</w:t>
+        <w:t>Kerakli blok ustiga sichqoncha keltirilib, chap tugma bosib turilgan holda blok yangi joyga sudraladi. Lozim bo'lsa, blokni burish yoki aks ettirish amallaridan ham foydalaniladi.</w:t>
       </w:r>
     </w:p>
     <w:p>
@@ -3405,7 +3405,7 @@
           <w:szCs w:val="28"/>
           <w:lang w:val="en-US"/>
         </w:rPr>
-        <w:t xml:space="preserve">Blokni bog‘lovchi liniyadan uzish uchun bog‘lanish chizig‘i tanlanadi va </w:t>
+        <w:t xml:space="preserve"> Bog'lanishni uzish uchun mos chiziq belgilanib, klaviaturadan </w:t>
       </w:r>
       <w:r>
         <w:rPr>
@@ -3739,7 +3739,7 @@
           <w:szCs w:val="28"/>
           <w:lang w:val="en-US"/>
         </w:rPr>
-        <w:t xml:space="preserve"> joylashgan. U barcha mijoz kompyuterlari va serverni o'zaro bog'lab turuvchi tugun vazifasini bajaradi. Switch ma'lumotlar paketini tarmoqdagi barcha kompyuterlarga emas, balki faqat qabul qiluvchi qurilmaning MAC-manziliga qarab, aniq manzilli yo'naltiradi. Yashil nuqtalar ulanishlar faol va to'g'ri sozlanganligini bildiradi.</w:t>
+        <w:t xml:space="preserve"> o'rnatilgan. U mijoz kompyuterlari bilan serverni yagona tugunda birlashtiradi. Switch kelgan paketni barcha qurilmalarga emas, balki qabul qiluvchining MAC-manziliga qarab faqat kerakli portga yo'naltiradi. Yashil belgilar ulanishlar faol va to'g'ri sozlanganini ko'rsatadi.</w:t>
       </w:r>
     </w:p>
     <w:p>
@@ -3774,7 +3774,7 @@
           <w:lang w:val="en-US"/>
         </w:rPr>
         <w:lastRenderedPageBreak/>
-        <w:t>Tarmoqda bitta ko'p funksiyali server va turli xizmatlardan foydalanuvchi 4 ta mijoz (client) kompyuteri mavjud:</w:t>
+        <w:t>Tarmoq bitta universal serverdan va undan turli xizmatlar oladigan 4 ta mijoz kompyuteridan tashkil topgan:</w:t>
       </w:r>
     </w:p>
     <w:p>
@@ -3803,7 +3803,7 @@
           <w:szCs w:val="28"/>
           <w:lang w:val="en-US"/>
         </w:rPr>
-        <w:t xml:space="preserve"> Tarmoqning eng yuqori qismida joylashgan. "Multi" so'zi ushbu yagona server bir vaqtning o'zida bir nechta tarmoq xizmatlarini (HTTP, FTP, DNS, E-Mail) o'zida jamlaganini va mijozlarga xizmat ko'rsatishini anglatadi.</w:t>
+        <w:t xml:space="preserve"> Sxemaning eng tepasida turibdi. Multi atamasi bitta serverning bir vaqtda bir nechta xizmatni (HTTP, FTP, DNS, E-Mail) bajarib, mijozlarga xizmat ko'rsatishini bildiradi.</w:t>
       </w:r>
     </w:p>
     <w:p>
@@ -3832,7 +3832,7 @@
           <w:szCs w:val="28"/>
           <w:lang w:val="en-US"/>
         </w:rPr>
-        <w:t xml:space="preserve"> Serverdagi veb-saytlarga kirish (masalan, brauzer orqali) va veb-sahifalarni ko'rish sozlangan kompyuter.</w:t>
+        <w:t xml:space="preserve"> Server joylashtirilgan veb-resurslarga brauzer orqali ulanib, sahifalarni ochish uchun sozlangan kompyuter.</w:t>
       </w:r>
     </w:p>
     <w:p>
@@ -3861,7 +3861,7 @@
           <w:szCs w:val="28"/>
           <w:lang w:val="en-US"/>
         </w:rPr>
-        <w:t xml:space="preserve"> Serverga fayllarni yuklash (upload) yoki serverdan fayllarni ko'chirib olish (download) xizmatini tekshiruvchi kompyuter.</w:t>
+        <w:t xml:space="preserve"> Serverga fayl jo'natish (upload) yoki serverdan fayl olish (download) xizmatini sinaydigan kompyuter.</w:t>
       </w:r>
     </w:p>
     <w:p>
@@ -3890,7 +3890,7 @@
           <w:szCs w:val="28"/>
           <w:lang w:val="en-US"/>
         </w:rPr>
-        <w:t xml:space="preserve"> Tarmoq ichida elektron xatlar yuborish va qabul qilish xizmati yuklatilgan kompyuter.</w:t>
+        <w:t xml:space="preserve"> Tarmoq doirasida xat yuborish va qabul qilish vazifasini bajaradigan kompyuter.</w:t>
       </w:r>
     </w:p>
     <w:p>
@@ -3919,7 +3919,7 @@
           <w:szCs w:val="28"/>
           <w:lang w:val="en-US"/>
         </w:rPr>
-        <w:t xml:space="preserve"> Serverdagi IP-manzillarni harfli domen nomlariga (yoki aksincha) aylantirish xizmatidan foydalanuvchi kompyuter.</w:t>
+        <w:t xml:space="preserve"> IP-manzillarni domen nomlariga (yoki teskarisiga) o'giruvchi xizmatdan foydalanadigan kompyuter.</w:t>
       </w:r>
     </w:p>
     <w:p>
@@ -3971,7 +3971,7 @@
           <w:szCs w:val="28"/>
           <w:lang w:val="en-US"/>
         </w:rPr>
-        <w:t xml:space="preserve"> hisoblanadi. Talabalar ushbu sxemada server ichiga kirib har bir xizmatni faollashtiradi (ON qiladi) va mijoz kompyuterlaridan turib tarmoqning ishlashini simulyatsiya rejimida testdan o'tkazishadi.</w:t>
+        <w:t xml:space="preserve"> deb belgilanadi. Talaba server ichiga kirib har bir xizmatni yoqadi (ON holatiga keltiradi) va mijoz kompyuterlaridan turib tarmoq ishini simulyatsiya rejimida sinab ko'radi.</w:t>
       </w:r>
     </w:p>
     <w:p>
@@ -4302,7 +4302,7 @@
           <w:szCs w:val="28"/>
           <w:lang w:val="en-US"/>
         </w:rPr>
-        <w:t xml:space="preserve"> hisoblanadi. Bu manzilga so'rov yuborilganda, signal tarmoqdagi barcha faol kompyuterlarga bir vaqtning o'zida yetib boradi va ularning barchasidan javob qaytadi.</w:t>
+        <w:t xml:space="preserve"> bo'lib hisoblanadi. Ushbu manzilga so'rov jo'natilganda paket tarmoqdagi barcha faol qurilmalarga bir vaqtda yetib boradi va har biridan javob qaytadi.</w:t>
       </w:r>
     </w:p>
     <w:p>
@@ -4331,7 +4331,7 @@
           <w:szCs w:val="28"/>
           <w:lang w:val="en-US"/>
         </w:rPr>
-        <w:t xml:space="preserve"> Grafikda ko'rinib turganidek, bitta so'rovga tarmoqdagi barcha mijozlardan ketma-ket javob kelgan:</w:t>
+        <w:t xml:space="preserve"> Rasmdan ko'rinishicha, yagona so'rovga tarmoqdagi hamma mijozdan ketma-ket javob kelgan:</w:t>
       </w:r>
     </w:p>
     <w:p>
@@ -4480,7 +4480,7 @@
           <w:szCs w:val="28"/>
           <w:lang w:val="en-US"/>
         </w:rPr>
-        <w:t>), lekin tarmoqdagi barcha qurilmalar javob bergani uchun jami 16 ta javob paketi qabul qilingan (</w:t>
+        <w:t>), biroq tarmoqdagi barcha qurilma javob qaytargani bois jami 16 ta javob paketi olingan (</w:t>
       </w:r>
       <w:r>
         <w:rPr>
@@ -4533,7 +4533,7 @@
           <w:szCs w:val="28"/>
           <w:lang w:val="en-US"/>
         </w:rPr>
-        <w:t>). Bu tarmoqning benuqson ishlayotganini ko'rsatadi.</w:t>
+        <w:t>). Bu esa tarmoqning to'liq va xatosiz ishlayotganini tasdiqlaydi.</w:t>
       </w:r>
     </w:p>
     <w:p>
@@ -4660,7 +4660,7 @@
           <w:sz w:val="28"/>
           <w:szCs w:val="28"/>
         </w:rPr>
-        <w:t xml:space="preserve"> buyrug'i server o'z xotirasida (keshida) saqlab qolgan tarmoqdagi boshqa qurilmalarning ro'yxatini chiqarib beradi.</w:t>
+        <w:t xml:space="preserve"> buyrug'i server keshida saqlangan boshqa qurilmalar ro'yxatini ekranga chiqaradi.</w:t>
       </w:r>
     </w:p>
     <w:p>
@@ -4689,7 +4689,7 @@
           <w:szCs w:val="28"/>
           <w:lang w:val="en-US"/>
         </w:rPr>
-        <w:t xml:space="preserve"> Jadvalda tarmoqdagi 4 ta mijoz kompyuterining mantiqiy IP-manzillari va ularga mos keluvchi jismoniy </w:t>
+        <w:t xml:space="preserve"> Jadvalda 4 ta mijoz kompyuterining mantiqiy IP-manzillari va ularga mos jismoniy </w:t>
       </w:r>
       <w:r>
         <w:rPr>
@@ -4881,7 +4881,7 @@
           <w:sz w:val="28"/>
           <w:szCs w:val="28"/>
         </w:rPr>
-        <w:t xml:space="preserve"> deb ko'rsatilgan, ya'ni bu ma'lumotlar tarmoq almashinuvi paytida avtomatik ravishda aniqlangan</w:t>
+        <w:t xml:space="preserve"> deb belgilangan, ya'ni bu yozuvlar almashinuv jarayonida avtomatik tarzda aniqlangan</w:t>
       </w:r>
       <w:r>
         <w:t>.</w:t>
@@ -4932,7 +4932,7 @@
           <w:sz w:val="28"/>
           <w:szCs w:val="28"/>
         </w:rPr>
-        <w:t xml:space="preserve">Broadcast ping yuborish orqali barcha kompyuterlar tarmoqda faol ekanligi va markaziy </w:t>
+        <w:t xml:space="preserve">Broadcast ping orqali hamma kompyuter tarmoqda faolligi va markaziy </w:t>
       </w:r>
       <w:r>
         <w:rPr>
@@ -4967,7 +4967,7 @@
           <w:sz w:val="28"/>
           <w:szCs w:val="28"/>
         </w:rPr>
-        <w:t xml:space="preserve"> buyrug'i orqali esa server barcha mijozlarning jismoniy manzillarini muvaffaqiyatli tanib olgani isbotlangan.</w:t>
+        <w:t xml:space="preserve"> buyrug'i bilan esa server barcha mijozning jismoniy manzilini to'g'ri aniqlagani isbotlanadi.</w:t>
       </w:r>
     </w:p>
     <w:p>
@@ -5104,7 +5104,7 @@
           <w:szCs w:val="28"/>
           <w:lang w:val="en-US"/>
         </w:rPr>
-        <w:t xml:space="preserve"> (Hodisalar ro'yxati) jadvaliga e'tibor bersak, tarmoqda yangi hodisa (paket) hosil bo'lganini ko'rishimiz mumkin:</w:t>
+        <w:t xml:space="preserve"> (Hodisalar ro'yxati) jadvaliga qaralsa, tarmoqda yangi paket paydo bo'lgani ko'rinadi:</w:t>
       </w:r>
     </w:p>
     <w:p>
@@ -5398,7 +5398,7 @@
           <w:szCs w:val="28"/>
           <w:lang w:val="en-US"/>
         </w:rPr>
-        <w:t>) serverga veb-sahifa so'rovi (HTTP so'rovi) yuborishdan oldin, transport qatlamida ishonchli aloqa kanalini o'rnatishi kerak.</w:t>
+        <w:t>) serverga HTTP so'rovini jo'natishdan avval transport qatlamida ishonchli aloqa kanalini o'rnatishi shart.</w:t>
       </w:r>
     </w:p>
     <w:p>
@@ -5435,7 +5435,7 @@
           <w:szCs w:val="28"/>
           <w:lang w:val="en-US"/>
         </w:rPr>
-        <w:t xml:space="preserve"> ustida ishlagani sababli, birinchi bo'lib aloqa o'rnatuvchi maxsus TCP paketi (ko'pincha </w:t>
+        <w:t xml:space="preserve"> ustida ishlovchi protokol bo'lgani uchun, dastlab aloqani boshlovchi maxsus TCP paketi (odatda </w:t>
       </w:r>
       <w:r>
         <w:rPr>
@@ -5537,7 +5537,7 @@
           <w:szCs w:val="28"/>
           <w:lang w:val="en-US"/>
         </w:rPr>
-        <w:t xml:space="preserve"> Simulyatsiyani avtomatik rejimda ishga tushiradi (paket o'zi kompyuterdan switchga, switchdan serverga qarab yura boshlaydi).</w:t>
+        <w:t xml:space="preserve"> Simulyatsiyani avtomatik tarzda yuritadi (paket kompyuterdan kommutatorga, undan serverga o'zi harakatlanadi).</w:t>
       </w:r>
     </w:p>
     <w:p>
@@ -5587,7 +5587,7 @@
           <w:szCs w:val="28"/>
           <w:lang w:val="en-US"/>
         </w:rPr>
-        <w:t xml:space="preserve"> Paketni qo'lda, bitta-bitta bosqich (qadam) bo'yicha harakatlantiradi. Har safar bosilganda xatjild keyingi qurilmaga o'tadi va o'ng tarafdagi ro'yxat yangilanib boradi.</w:t>
+        <w:t xml:space="preserve"> Paketni qadam-baqadam, qo'lda harakatlantiradi. Har bosishda konvert keyingi qurilmaga siljiydi va o'ngdagi ro'yxat yangilanadi.</w:t>
       </w:r>
     </w:p>
     <w:p>
@@ -5624,7 +5624,7 @@
           <w:szCs w:val="28"/>
           <w:lang w:val="en-US"/>
         </w:rPr>
-        <w:t xml:space="preserve"> bosqichini ko'rsatadi. Bu yerda veb-mijoz server bilan xavfsiz aloqa seansini boshlash uchun dastlabki paketni tayyorlab turibdi. Simulyatsiya boshlansa, ushbu xatjild </w:t>
+        <w:t xml:space="preserve"> bosqichini aks ettiradi. Bunda veb-mijoz server bilan ishonchli aloqa seansini ochish uchun birinchi paketni tayyorlamoqda. Simulyatsiya yurganda ushbu konvert </w:t>
       </w:r>
       <w:r>
         <w:rPr>
@@ -5956,7 +5956,7 @@
           <w:szCs w:val="28"/>
           <w:lang w:val="en-US"/>
         </w:rPr>
-        <w:t>TCP (Transmission Control Protocol) va UDP (User Datagram Protocol) transport qatlamining protokollari hisoblanadi. TCP ulanishga yo‘naltirilgan protokol bo‘lib, ma’lumotlarni ishonchli yetkazib berishni ta’minlaydi. UDP esa ulanishsiz ishlaydi va ma’lumotlarni tez uzatishga mo‘ljallangan. TCP paketlarning yetib borganligini tekshiradi, UDP esa bunday nazoratni amalga oshirmaydi.</w:t>
+        <w:t>TCP (Transmission Control Protocol) va UDP (User Datagram Protocol) — transport qatlami protokollaridir. TCP ulanishga asoslangan bo'lib, ma'lumotni ishonchli yetkazadi; UDP esa ulanishsiz ishlab, tezkor uzatishga qaratilgan. TCP paketning yetib borganini nazorat qiladi, UDP bunday tekshiruvni o'tkazmaydi.</w:t>
       </w:r>
     </w:p>
     <w:p>
@@ -6169,7 +6169,7 @@
           <w:szCs w:val="28"/>
           <w:lang w:val="en-US"/>
         </w:rPr>
-        <w:t>UDP protokoli paketlarning yetib borishini tekshirmaydi. Agar paket yo‘qolsa yoki buzilsa, u qayta yuborilmaydi. Natijada ma’lumotning bir qismi qabul qilinmasligi mumkin. Bu holat tezlikni oshiradi, ammo ishonchlilikni kamaytiradi.</w:t>
+        <w:t>UDP paketning manzilga yetib borishini nazorat qilmaydi. Paket yo'qolsa yoki shikastlansa, u qayta jo'natilmaydi. Oqibatda ma'lumotning bir qismi yo'qolishi mumkin. Bu tezlikni oshiradi, ammo ishonchlilikni pasaytiradi.</w:t>
       </w:r>
     </w:p>
     <w:p>
@@ -6510,7 +6510,7 @@
           <w:szCs w:val="28"/>
           <w:lang w:val="en-US"/>
         </w:rPr>
-        <w:t>UDP yuqori tezlik talab qilinadigan va kichik yo‘qotishlarga bardosh beradigan ilovalarda qo‘llaniladi:</w:t>
+        <w:t>UDP yuqori tezlik zarur bo'lgan va kichik yo'qotishlarga chidamli ilovalarda qo'llaniladi:</w:t>
       </w:r>
     </w:p>
     <w:p>
@@ -6652,7 +6652,7 @@
           <w:szCs w:val="28"/>
           <w:lang w:val="en-US"/>
         </w:rPr>
-        <w:t>Bu ilovalarda tezlik ishonchlilikdan muhimroq hisoblanadi.</w:t>
+        <w:t>Bunday ilovalarda tezlik ishonchlilikdan ko'ra ustunroq turadi.</w:t>
       </w:r>
     </w:p>
     <w:p>
@@ -6694,7 +6694,7 @@
           <w:szCs w:val="28"/>
           <w:lang w:val="en-US"/>
         </w:rPr>
-        <w:t>TCP ma’lumotlarning to‘liq va xatosiz yetkazilishi talab qilinadigan ilovalarda ishlatiladi:</w:t>
+        <w:t>TCP ma'lumot to'liq va xatosiz yetib borishi talab etiladigan ilovalarda ishlatiladi:</w:t>
       </w:r>
     </w:p>
     <w:p>
@@ -6819,7 +6819,7 @@
           <w:sz w:val="28"/>
           <w:szCs w:val="28"/>
         </w:rPr>
-        <w:t>Bu ilovalarda ma’lumotlarning yo‘qolishi yoki buzilishi qabul qilinmaydi.</w:t>
+        <w:t>Bunday ilovalarda ma'lumotning yo'qolishi yoki buzilishiga yo'l qo'yib bo'lmaydi.</w:t>
       </w:r>
     </w:p>
     <w:p>
@@ -7472,7 +7472,7 @@
           <w:szCs w:val="28"/>
           <w:lang w:val="en-US"/>
         </w:rPr>
-        <w:t>Xulosa qilib aytganda, TCP ma’lumotlarni ishonchli yetkazish uchun, UDP esa maksimal tezlikni ta’minlash uchun qo‘llaniladi. Qaysi protokoldan foydalanish ilovaning talablariga bog‘liq.</w:t>
+        <w:t>Xulosa shuki, TCP ma'lumotni ishonchli yetkazishga, UDP esa eng yuqori tezlikni ta'minlashga mo'ljallangan. Qaysi birini tanlash ilovaning ehtiyojiga bog'liq.</w:t>
       </w:r>
     </w:p>
     <w:p>
@@ -7708,7 +7708,7 @@
           <w:szCs w:val="28"/>
           <w:lang w:val="en-US"/>
         </w:rPr>
-        <w:t>Sxemada gibrid (ham simli, ham simsiz) tarmoq arxitekturasi shakllantirilgan:</w:t>
+        <w:t>Sxemada aralash (ham simli, ham simsiz) tarmoq tuzilmasi qurilgan:</w:t>
       </w:r>
     </w:p>
     <w:p>
@@ -7760,7 +7760,7 @@
           <w:szCs w:val="28"/>
           <w:lang w:val="en-US"/>
         </w:rPr>
-        <w:t>) va mahalliy marshrutizatori. U ichki tarmoqdagi qurilmalarga IP-manzillarni avtomatik tarqatadi (DHCP xizmati orqali) va simsiz aloqa zonasini yaratadi.</w:t>
+        <w:t>) hamda mahalliy marshrutizator vazifasini bajaradi. U ichki qurilmalarga DHCP orqali IP-manzil tarqatadi va simsiz qamrov zonasini hosil qiladi.</w:t>
       </w:r>
     </w:p>
     <w:p>
@@ -7792,7 +7792,7 @@
           <w:szCs w:val="28"/>
           <w:lang w:val="en-US"/>
         </w:rPr>
-        <w:t xml:space="preserve"> Simsiz routerning yuqori qismiga (Internet yoki WAN portiga) ulangan. Bu tashqi tarmoqlarga yoki internet provayderga chiqishni simulyatsiya qilish uchun qo'yilgan.</w:t>
+        <w:t xml:space="preserve"> Simsiz routerning WAN (Internet) portiga ulangan. U tashqi tarmoq yoki provayderga chiqishni taqlid qilish uchun qo'shilgan.</w:t>
       </w:r>
     </w:p>
     <w:p>
@@ -7844,7 +7844,7 @@
           <w:szCs w:val="28"/>
           <w:lang w:val="en-US"/>
         </w:rPr>
-        <w:t xml:space="preserve"> orqali standart Ethernet portidan simli ulangan.</w:t>
+        <w:t xml:space="preserve"> orqali oddiy Ethernet porti yordamida simli ravishda ulangan</w:t>
       </w:r>
     </w:p>
     <w:p>
@@ -7896,7 +7896,7 @@
           <w:szCs w:val="28"/>
           <w:lang w:val="en-US"/>
         </w:rPr>
-        <w:t xml:space="preserve"> texnologiyasi orqali ulangan. Rasmdagi punktir (shtrix) chiziqlar aynan radioaloqa (simsiz signal) mavjudligini bildiradi.</w:t>
+        <w:t xml:space="preserve"> texnologiyasi yordamida ulangan. Rasmdagi uzuq (shtrix) chiziqlar radioaloqa, ya'ni simsiz signal borligini ifodalaydi.</w:t>
       </w:r>
     </w:p>
     <w:p>
@@ -7934,7 +7934,7 @@
           <w:szCs w:val="28"/>
           <w:lang w:val="en-US"/>
         </w:rPr>
-        <w:t>Ushbu laboratoriya ishini bajarishda asosan quyidagi bosqichlar amalga oshiriladi:</w:t>
+        <w:t>Mazkur ishni bajarishda quyidagi asosiy bosqichlar amalga oshiriladi:</w:t>
       </w:r>
     </w:p>
     <w:p>
@@ -7965,7 +7965,7 @@
           <w:szCs w:val="28"/>
           <w:lang w:val="en-US"/>
         </w:rPr>
-        <w:t xml:space="preserve"> Standart noutbuklarda Ethernet porti bo'ladi. Talaba noutbuk ichiga kirib, uni o'chiradi, simli tarmoq kartasini olib tashlab, o'rniga </w:t>
+        <w:t xml:space="preserve"> Standart noutbukda Ethernet porti bo'ladi. Talaba noutbukni o'chirib, simli tarmoq modulini chiqarib, o'rniga </w:t>
       </w:r>
       <w:r>
         <w:rPr>
@@ -7993,7 +7993,7 @@
           <w:sz w:val="28"/>
           <w:szCs w:val="28"/>
         </w:rPr>
-        <w:t>Shundan keyingina noutbuklar routerga avtomatik ulanadi.</w:t>
+        <w:t>Shundagina noutbuklar routerga o'z-o'zidan ulanadi.</w:t>
       </w:r>
     </w:p>
     <w:p>
@@ -8121,7 +8121,7 @@
           <w:sz w:val="28"/>
           <w:szCs w:val="28"/>
         </w:rPr>
-        <w:t xml:space="preserve"> o'rtasida statik yoki dinamik marshrutlash o'rnatilib, ichki mijozlardan (PC yoki noutbuklardan) tashqi routerga </w:t>
+        <w:t xml:space="preserve"> o'rtasida statik yoki dinamik marshrutlash sozlanib, ichki mijozlardan (kompyuter yoki noutbuklardan) tashqi routerga </w:t>
       </w:r>
       <w:r>
         <w:rPr>
@@ -8757,7 +8757,7 @@
           <w:szCs w:val="28"/>
           <w:lang w:val="en-US"/>
         </w:rPr>
-        <w:t>Veb-interfeysga kirish uchun kompyuter yoki mobil qurilma routerga kabel yoki WiFi orqali ulanadi. So‘ngra internet brauzeri ochilib, manzil satriga routerning IP manzili kiritiladi. Odatda bu manzil 192.168.0.1 yoki 192.168.1.1 bo‘ladi. Shundan keyin foydalanuvchi nomi va parol kiritilib, routerning boshqaruv oynasiga kiriladi.</w:t>
+        <w:t>Veb-interfeysga ulanish uchun kompyuter yoki mobil qurilma routerga kabel yoxud WiFi orqali bog'lanadi. So'ng brauzer ochilib, manzil qatoriga routerning IP-manzili yoziladi (ko'pincha 192.168.10.1 yoki 192.168.100.1). Keyin login va parol kiritilib, boshqaruv paneliga kiriladi.</w:t>
       </w:r>
     </w:p>
     <w:p>

</xml_diff>

<commit_message>
Rasmlarni bir xil (uniform) sozlash + qo'shimcha matn tahriri va oq fonlarni olib tashlash
</commit_message>
<xml_diff>
--- a/To'xtaturimova Mohichehra 1.2.3.docx
+++ b/To'xtaturimova Mohichehra 1.2.3.docx
@@ -111,7 +111,6 @@
     </w:p>
     <w:p>
       <w:pPr>
-        <w:shd w:val="clear" w:color="auto" w:fill="FFFFFF"/>
         <w:spacing w:line="276" w:lineRule="auto"/>
         <w:ind w:left="10" w:hanging="10"/>
         <w:rPr>
@@ -216,7 +215,6 @@
     </w:p>
     <w:p>
       <w:pPr>
-        <w:shd w:val="clear" w:color="auto" w:fill="FFFFFF"/>
         <w:spacing w:line="276" w:lineRule="auto"/>
         <w:ind w:left="10" w:firstLine="454"/>
         <w:rPr>
@@ -230,7 +228,6 @@
     </w:p>
     <w:p>
       <w:pPr>
-        <w:shd w:val="clear" w:color="auto" w:fill="FFFFFF"/>
         <w:spacing w:line="276" w:lineRule="auto"/>
         <w:ind w:right="566" w:firstLine="0"/>
         <w:rPr>
@@ -336,7 +333,7 @@
           <w:sz w:val="28"/>
           <w:szCs w:val="28"/>
         </w:rPr>
-        <w:t>Sxemada quyidagi bloklardan foydalanilgan:</w:t>
+        <w:t>Quyidagi bloklar modelda qo'llanilgan:</w:t>
       </w:r>
     </w:p>
     <w:p>
@@ -472,7 +469,6 @@
     </w:p>
     <w:p>
       <w:pPr>
-        <w:shd w:val="clear" w:color="auto" w:fill="FFFFFF"/>
         <w:spacing w:line="276" w:lineRule="auto"/>
         <w:ind w:right="1133" w:firstLine="0"/>
         <w:jc w:val="center"/>
@@ -484,7 +480,6 @@
     </w:p>
     <w:p>
       <w:pPr>
-        <w:shd w:val="clear" w:color="auto" w:fill="FFFFFF"/>
         <w:spacing w:line="276" w:lineRule="auto"/>
         <w:ind w:firstLine="0"/>
         <w:rPr>
@@ -498,7 +493,6 @@
     </w:p>
     <w:p>
       <w:pPr>
-        <w:shd w:val="clear" w:color="auto" w:fill="FFFFFF"/>
         <w:spacing w:line="276" w:lineRule="auto"/>
         <w:ind w:right="14" w:firstLine="0"/>
         <w:rPr>
@@ -998,7 +992,6 @@
     </w:p>
     <w:p>
       <w:pPr>
-        <w:shd w:val="clear" w:color="auto" w:fill="FFFFFF"/>
         <w:spacing w:line="276" w:lineRule="auto"/>
         <w:ind w:right="14" w:firstLine="0"/>
         <w:rPr>
@@ -2119,7 +2112,7 @@
           <w:szCs w:val="28"/>
           <w:lang w:val="en-US"/>
         </w:rPr>
-        <w:t>Simulink dasturini bir necha usulda ishga tushirish mumkin:</w:t>
+        <w:t>Simulink dasturini bir qancha yo'l bilan ishga tushirish mumkin:</w:t>
       </w:r>
     </w:p>
     <w:p>
@@ -2283,7 +2276,7 @@
           <w:szCs w:val="28"/>
           <w:lang w:val="en-US"/>
         </w:rPr>
-        <w:t>Simulink bibliotekasi quyidagi asosiy bo‘limlardan tashkil topgan:</w:t>
+        <w:t>Simulink kutubxonasi asosan quyidagi bo'limlarga ajratilgan:</w:t>
       </w:r>
     </w:p>
     <w:p>
@@ -2508,7 +2501,7 @@
           <w:szCs w:val="28"/>
           <w:lang w:val="en-US"/>
         </w:rPr>
-        <w:t>Asboblar panelidagi asosiy tugmalar quyidagi vazifalarni bajaradi:</w:t>
+        <w:t>Asboblar panelidagi tugmalarning asosiy vazifalari quyidagicha:</w:t>
       </w:r>
     </w:p>
     <w:p>
@@ -2856,7 +2849,7 @@
           <w:szCs w:val="28"/>
           <w:lang w:val="en-US"/>
         </w:rPr>
-        <w:t>Model yaratish quyidagi ketma-ketlikda amalga oshiriladi:</w:t>
+        <w:t>Model qurish jarayoni quyidagi tartibda kechadi:</w:t>
       </w:r>
     </w:p>
     <w:p>
@@ -3064,7 +3057,7 @@
           <w:szCs w:val="28"/>
           <w:lang w:val="en-US"/>
         </w:rPr>
-        <w:t>Model oynasi quyidagi elementlardan iborat:</w:t>
+        <w:t>Model oynasi tarkibida quyidagi qismlar mavjud:</w:t>
       </w:r>
     </w:p>
     <w:p>
@@ -3592,7 +3585,7 @@
           <w:szCs w:val="28"/>
           <w:lang w:val="en-US"/>
         </w:rPr>
-        <w:t>Berilgan Cisco Packet Tracer faylidan foydalaning</w:t>
+        <w:t>Tayyor Cisco Packet Tracer faylidan foydalaniladi</w:t>
       </w:r>
     </w:p>
     <w:p>
@@ -4218,7 +4211,7 @@
           <w:szCs w:val="28"/>
           <w:lang w:val="en-US"/>
         </w:rPr>
-        <w:t>Oynaning yuqoridagi qismida serverdan turib quyidagi buyruq berilgan:</w:t>
+        <w:t>Oynaning yuqori qismida serverdan turib quyidagi buyruq kiritilgan:</w:t>
       </w:r>
     </w:p>
     <w:p>
@@ -4567,7 +4560,7 @@
           <w:szCs w:val="28"/>
           <w:lang w:val="en-US"/>
         </w:rPr>
-        <w:t>Pastki qismida ikkinchi muhim buyruq bajarilgan:</w:t>
+        <w:t>Quyi qismda esa ikkinchi muhim buyruq ishlatilgan:</w:t>
       </w:r>
     </w:p>
     <w:p>
@@ -5487,7 +5480,7 @@
           <w:szCs w:val="28"/>
           <w:lang w:val="en-US"/>
         </w:rPr>
-        <w:t>Panelning o'rtasidagi tugmalar paketning tarmoq bo'ylab harakatlanishini boshqaradi:</w:t>
+        <w:t>Panel markazidagi tugmalar paketning tarmoqdagi harakatini boshqaradi:</w:t>
       </w:r>
     </w:p>
     <w:p>
@@ -5998,7 +5991,7 @@
           <w:szCs w:val="28"/>
           <w:lang w:val="en-US"/>
         </w:rPr>
-        <w:t>TCP ishonchlilikni bir nechta mexanizmlar orqali ta’minlaydi:</w:t>
+        <w:t>TCP ishonchlilikni quyidagi mexanizmlar yordamida ta'minlaydi:</w:t>
       </w:r>
     </w:p>
     <w:p>
@@ -6211,7 +6204,7 @@
           <w:szCs w:val="28"/>
           <w:lang w:val="en-US"/>
         </w:rPr>
-        <w:t>Cisco Packet Tracer’da paketlarni kuzatish uchun quyidagi amallar bajariladi:</w:t>
+        <w:t>Cisco Packet Tracer'da paketlarni kuzatish quyidagi tartibda olib boriladi:</w:t>
       </w:r>
     </w:p>
     <w:p>
@@ -6381,7 +6374,7 @@
           <w:szCs w:val="28"/>
           <w:lang w:val="en-US"/>
         </w:rPr>
-        <w:t>TCP ulanishni o‘rnatish uchun uch bosqichli almashuvdan foydalanadi:</w:t>
+        <w:t>TCP ulanishni hosil qilish uchun uch qadamli almashinuvni qo'llaydi:</w:t>
       </w:r>
     </w:p>
     <w:p>
@@ -8799,7 +8792,7 @@
           <w:szCs w:val="28"/>
           <w:lang w:val="en-US"/>
         </w:rPr>
-        <w:t>WiFi routerni sozlash quyidagi tartibda amalga oshiriladi:</w:t>
+        <w:t>WiFi routerni sozlash quyidagi bosqichlarda amalga oshiriladi:</w:t>
       </w:r>
     </w:p>
     <w:p>
@@ -9035,7 +9028,7 @@
           <w:szCs w:val="28"/>
           <w:lang w:val="en-US"/>
         </w:rPr>
-        <w:t>WiFi adapterni sozlash uchun quyidagi amallar bajariladi:</w:t>
+        <w:t>WiFi adapterni sozlash uchun quyidagi qadamlar bajariladi:</w:t>
       </w:r>
     </w:p>
     <w:p>

</xml_diff>